<commit_message>
docs(avance-3): quita el conteo fijo de commits de la tabla de criterios
</commit_message>
<xml_diff>
--- a/docs/AutoGestion_Avance_Proyecto_Final_3.docx
+++ b/docs/AutoGestion_Avance_Proyecto_Final_3.docx
@@ -1509,7 +1509,7 @@
                 <w:sz w:val="19"/>
                 <w:szCs w:val="19"/>
               </w:rPr>
-              <w:t xml:space="preserve">), CHANGELOG versionado y 65 </w:t>
+              <w:t xml:space="preserve">), CHANGELOG versionado y un historial de </w:t>
             </w:r>
             <w:proofErr w:type="spellStart"/>
             <w:r>
@@ -1525,7 +1525,7 @@
                 <w:sz w:val="19"/>
                 <w:szCs w:val="19"/>
               </w:rPr>
-              <w:t>.</w:t>
+              <w:t xml:space="preserve"> separados por intención.</w:t>
             </w:r>
           </w:p>
         </w:tc>

</xml_diff>

<commit_message>
docs(avance-3): las cifras del informe se alinean con el codigo
El informe decia 98 pruebas, migraciones V1-V9, 20 controladores,
25 servicios, 26 paginas y mas de 70 commits; el codigo real tiene
140 pruebas, V10, 21 controladores, 26 servicios, 28 paginas y mas
de 100 commits. Se regenera la evidencia de mvn test (140/0) y se
suman al informe los modulos nuevos (QR, encuestas con comentarios
y baja de cuenta). Ademas se reemplaza la referencia inexistente
docs/PREGUNTAS_PROFE.md por docs/politicas-README.md y se corrige
el conteo de bloques Javadoc (236 -> 276).

Co-Authored-By: Codebuff <noreply@codebuff.com>
</commit_message>
<xml_diff>
--- a/docs/AutoGestion_Avance_Proyecto_Final_3.docx
+++ b/docs/AutoGestion_Avance_Proyecto_Final_3.docx
@@ -1624,7 +1624,7 @@
                 <w:sz w:val="19"/>
                 <w:szCs w:val="19"/>
               </w:rPr>
-              <w:t xml:space="preserve">26 páginas HTML: 15 del personal (incluido el </w:t>
+              <w:t xml:space="preserve">28 páginas HTML: 16 del personal (incluido el </w:t>
             </w:r>
             <w:proofErr w:type="spellStart"/>
             <w:r>
@@ -1640,7 +1640,7 @@
                 <w:sz w:val="19"/>
                 <w:szCs w:val="19"/>
               </w:rPr>
-              <w:t>), 10 del portal del cliente y la portada.</w:t>
+              <w:t>), 11 del portal del cliente y la portada.</w:t>
             </w:r>
           </w:p>
         </w:tc>
@@ -1749,7 +1749,7 @@
                 <w:sz w:val="19"/>
                 <w:szCs w:val="19"/>
               </w:rPr>
-              <w:t xml:space="preserve"> con 20 controladores, 25 servicios, 25 repositorios, 39 entidades (26 JPA + 13 </w:t>
+              <w:t xml:space="preserve"> con 21 controladores, 26 servicios, 25 repositorios, 39 entidades (26 JPA + 13 </w:t>
             </w:r>
             <w:proofErr w:type="spellStart"/>
             <w:r>
@@ -1781,7 +1781,7 @@
                 <w:sz w:val="19"/>
                 <w:szCs w:val="19"/>
               </w:rPr>
-              <w:t xml:space="preserve"> V1–V9; documentación alineada con el código.</w:t>
+              <w:t xml:space="preserve"> V1–V10; documentación alineada con el código.</w:t>
             </w:r>
           </w:p>
         </w:tc>
@@ -3757,7 +3757,7 @@
       </w:r>
       <w:proofErr w:type="gramEnd"/>
       <w:r>
-        <w:t xml:space="preserve"> con serie y correlativo), portal del cliente, solicitudes de cotización, proveedores, gastos operativos, equipo de trabajo, exportación a Excel y PDF y consulta de documentos (DNI/RUC) </w:t>
+        <w:t xml:space="preserve"> con serie y correlativo), portal del cliente, solicitudes de cotización, proveedores, gastos operativos, equipo de trabajo, exportación a Excel y PDF por tabla, QR verificable en el comprobante, encuestas de satisfacción con su panel de comentarios, baja de cuenta del portal y consulta de documentos (DNI/RUC) </w:t>
       </w:r>
       <w:r>
         <w:t>con varias fuentes.</w:t>
@@ -9387,7 +9387,7 @@
       </w:r>
       <w:proofErr w:type="spellEnd"/>
       <w:r>
-        <w:t xml:space="preserve"> y diseño adaptable. El sistema entrega 26 páginas: 15 del personal (</w:t>
+        <w:t xml:space="preserve"> y diseño adaptable. El sistema entrega 28 páginas: 16 del personal (</w:t>
       </w:r>
       <w:proofErr w:type="spellStart"/>
       <w:r>
@@ -9395,7 +9395,7 @@
       </w:r>
       <w:proofErr w:type="spellEnd"/>
       <w:r>
-        <w:t xml:space="preserve"> y 14 pantallas administrativas) y 11 del portal del cliente (pantalla de acceso y 10 secciones).</w:t>
+        <w:t xml:space="preserve"> y 15 pantallas administrativas) y 12 del portal del cliente (pantalla de acceso y 11 secciones).</w:t>
       </w:r>
     </w:p>
     <w:p>
@@ -9897,7 +9897,7 @@
         <w:spacing w:after="120" w:line="276" w:lineRule="auto"/>
       </w:pPr>
       <w:r>
-        <w:t xml:space="preserve">El código contiene alrededor de 236 bloques de documentación </w:t>
+        <w:t xml:space="preserve">El código contiene alrededor de 276 bloques de documentación </w:t>
       </w:r>
       <w:proofErr w:type="spellStart"/>
       <w:r>
@@ -9990,7 +9990,7 @@
       </w:r>
       <w:proofErr w:type="spellEnd"/>
       <w:r>
-        <w:t>/PREGUNTAS_PROFE.md.</w:t>
+        <w:t>/politicas-README.md.</w:t>
       </w:r>
     </w:p>
     <w:p>
@@ -10173,7 +10173,7 @@
                 <w:sz w:val="19"/>
                 <w:szCs w:val="19"/>
               </w:rPr>
-              <w:t>Ahora 39 entidades y 20 controladores por el crecimiento del alcance (comprobantes, portal, proveedores, gastos).</w:t>
+              <w:t>Ahora 39 entidades y 21 controladores por el crecimiento del alcance (comprobantes, portal, proveedores, gastos).</w:t>
             </w:r>
           </w:p>
         </w:tc>
@@ -10354,7 +10354,7 @@
                 <w:sz w:val="19"/>
                 <w:szCs w:val="19"/>
               </w:rPr>
-              <w:t xml:space="preserve"> (V1–V9) en </w:t>
+              <w:t xml:space="preserve"> (V1–V10) en </w:t>
             </w:r>
             <w:proofErr w:type="spellStart"/>
             <w:r>
@@ -10519,7 +10519,7 @@
                 <w:sz w:val="19"/>
                 <w:szCs w:val="19"/>
               </w:rPr>
-              <w:t xml:space="preserve">26 páginas implementadas; </w:t>
+              <w:t xml:space="preserve">28 páginas implementadas; </w:t>
             </w:r>
             <w:proofErr w:type="gramStart"/>
             <w:r>
@@ -12370,7 +12370,7 @@
       </w:r>
       <w:proofErr w:type="spellEnd"/>
       <w:r>
-        <w:t xml:space="preserve"> test: 98 pruebas ejecutadas, 0 fallos, BUILD SUCCESS. </w:t>
+        <w:t xml:space="preserve"> test: 140 pruebas ejecutadas, 0 fallos, BUILD SUCCESS. </w:t>
       </w:r>
       <w:r>
         <w:rPr>
@@ -12412,7 +12412,7 @@
       </w:r>
       <w:proofErr w:type="spellEnd"/>
       <w:r>
-        <w:t xml:space="preserve"> V1–V9. C.2 Arquitectura por capas (MVC + DAO + SOLID) y seguridad transversal. C.3 Cronograma real del proyecto con las fases entre</w:t>
+        <w:t xml:space="preserve"> V1–V10. C.2 Arquitectura por capas (MVC + DAO + SOLID) y seguridad transversal. C.3 Cronograma real del proyecto con las fases entre</w:t>
       </w:r>
       <w:r>
         <w:t xml:space="preserve"> las versiones del CHANGELOG. C.4 Flujo BPMN simplificado del proceso central, del ingreso del vehículo a la entrega con comprobante.</w:t>
@@ -12703,7 +12703,7 @@
       </w:r>
       <w:proofErr w:type="spellEnd"/>
       <w:r>
-        <w:t xml:space="preserve">: más de 70 </w:t>
+        <w:t xml:space="preserve">: más de 100 </w:t>
       </w:r>
       <w:proofErr w:type="spellStart"/>
       <w:r>

</xml_diff>